<commit_message>
Correct SAP integration doc: pricing revision is Salesforce-only
Remove the 6-monthly price-revision point from SAP integration
touchpoints — per BRN 5.2, 5.3, 5.4 pricing revision runs
entirely in Salesforce against quote line-item prices stored at
quote creation, using an Engineering-supplied formula. Add an
explicit "not a SAP integration" section listing pricing revision,
contract-based pricing, discount approvals, and activity/dashboards.

Co-Authored-By: Claude Opus 4.7 <noreply@anthropic.com>
Claude-Session: https://claude.ai/code/session_019wur7th1gcqTbRP99Ksj52
</commit_message>
<xml_diff>
--- a/Salesforce_SAP_Business_Integration.docx
+++ b/Salesforce_SAP_Business_Integration.docx
@@ -382,41 +382,6 @@
       <w:r>
         <w:rPr>
           <w:b/>
-          <w:color w:val="1F7A1F"/>
-          <w:sz w:val="26"/>
-        </w:rPr>
-        <w:t>10. Six-monthly price revision uses SAP part data as the base</w:t>
-      </w:r>
-    </w:p>
-    <w:p>
-      <w:r>
-        <w:rPr>
-          <w:b/>
-        </w:rPr>
-        <w:t xml:space="preserve">What flows: </w:t>
-      </w:r>
-      <w:r>
-        <w:t>The base index captured on the quote is stored in Salesforce. Every six months, when the current index is uploaded, Salesforce recalculates the revised price for every affected part and generates the customer-facing price sheet — pulling the current part list from SAP so nothing is missed.</w:t>
-      </w:r>
-    </w:p>
-    <w:p>
-      <w:r>
-        <w:rPr>
-          <w:b/>
-        </w:rPr>
-        <w:t xml:space="preserve">Business value: </w:t>
-      </w:r>
-      <w:r>
-        <w:t>What it replaces: manual Excel exercise that today misses parts and where price corrections get delayed.</w:t>
-      </w:r>
-    </w:p>
-    <w:p>
-      <w:pPr>
-        <w:spacing w:before="280" w:after="120"/>
-      </w:pPr>
-      <w:r>
-        <w:rPr>
-          <w:b/>
           <w:color w:val="1F3864"/>
           <w:sz w:val="32"/>
         </w:rPr>
@@ -769,40 +734,82 @@
           </w:p>
         </w:tc>
       </w:tr>
-      <w:tr>
-        <w:tc>
-          <w:tcPr>
-            <w:tcW w:type="dxa" w:w="3324"/>
-          </w:tcPr>
-          <w:p>
-            <w:r>
-              <w:t>6-monthly repricing</w:t>
-            </w:r>
-          </w:p>
-        </w:tc>
-        <w:tc>
-          <w:tcPr>
-            <w:tcW w:type="dxa" w:w="3324"/>
-          </w:tcPr>
-          <w:p>
-            <w:r>
-              <w:t>Current part list + prices</w:t>
-            </w:r>
-          </w:p>
-        </w:tc>
-        <w:tc>
-          <w:tcPr>
-            <w:tcW w:type="dxa" w:w="3324"/>
-          </w:tcPr>
-          <w:p>
-            <w:r>
-              <w:t>Sales / Costing</w:t>
-            </w:r>
-          </w:p>
-        </w:tc>
-      </w:tr>
     </w:tbl>
     <w:p/>
+    <w:p>
+      <w:pPr>
+        <w:spacing w:before="280" w:after="120"/>
+      </w:pPr>
+      <w:r>
+        <w:rPr>
+          <w:b/>
+          <w:color w:val="1F3864"/>
+          <w:sz w:val="32"/>
+        </w:rPr>
+        <w:t>What is NOT a SAP integration</w:t>
+      </w:r>
+    </w:p>
+    <w:p>
+      <w:r>
+        <w:t>Some steps of the process happen entirely inside Salesforce and do not touch SAP. These are called out here so nobody assumes they are integration points:</w:t>
+      </w:r>
+    </w:p>
+    <w:p>
+      <w:pPr>
+        <w:pStyle w:val="ListBullet"/>
+      </w:pPr>
+      <w:r>
+        <w:rPr>
+          <w:b/>
+        </w:rPr>
+        <w:t>Index-based / 6-monthly price revision</w:t>
+      </w:r>
+      <w:r>
+        <w:t xml:space="preserve"> — Runs entirely in Salesforce. The base price used for revision is the quote line-item price already stored in Salesforce at quote creation. Engineering supplies the formula; Salesforce recalculates and generates the revised-price PDF. Sending the PDF to the customer is a manual action, not an SAP push.</w:t>
+      </w:r>
+    </w:p>
+    <w:p>
+      <w:pPr>
+        <w:pStyle w:val="ListBullet"/>
+      </w:pPr>
+      <w:r>
+        <w:rPr>
+          <w:b/>
+        </w:rPr>
+        <w:t>Contract-based pricing &amp; expiry alerts (BRN 5.4)</w:t>
+      </w:r>
+      <w:r>
+        <w:t xml:space="preserve"> — Salesforce-only. Consumption tracking is informational; no SAP order-system integration in Phase 1.</w:t>
+      </w:r>
+    </w:p>
+    <w:p>
+      <w:pPr>
+        <w:pStyle w:val="ListBullet"/>
+      </w:pPr>
+      <w:r>
+        <w:rPr>
+          <w:b/>
+        </w:rPr>
+        <w:t>Discount / deviation approvals</w:t>
+      </w:r>
+      <w:r>
+        <w:t xml:space="preserve"> — Approval workflow lives in Salesforce; SAP is not consulted.</w:t>
+      </w:r>
+    </w:p>
+    <w:p>
+      <w:pPr>
+        <w:pStyle w:val="ListBullet"/>
+      </w:pPr>
+      <w:r>
+        <w:rPr>
+          <w:b/>
+        </w:rPr>
+        <w:t>Activity logging, email timeline, dashboards</w:t>
+      </w:r>
+      <w:r>
+        <w:t xml:space="preserve"> — Salesforce-native. SAP data appears in dashboards through the touchpoints above, but the reports themselves are Salesforce.</w:t>
+      </w:r>
+    </w:p>
     <w:p>
       <w:pPr>
         <w:spacing w:before="280" w:after="120"/>

</xml_diff>

<commit_message>
Simplify SAP integration doc to a single table
Strip narrative sections. Keep only the touchpoint table with the
corrected flow: PO recorded in Salesforce triggers SAP Sales Order
→ Invoice → GRN confirmation → order marked delivered. Product
serial numbers (including new ones from NPD) originate in SAP and
route to Salesforce; procurement fills price for new parts.

Co-Authored-By: Claude Opus 4.7 <noreply@anthropic.com>
Claude-Session: https://claude.ai/code/session_019wur7th1gcqTbRP99Ksj52
</commit_message>
<xml_diff>
--- a/Salesforce_SAP_Business_Integration.docx
+++ b/Salesforce_SAP_Business_Integration.docx
@@ -10,7 +10,7 @@
         <w:rPr>
           <w:b/>
           <w:color w:val="1F3864"/>
-          <w:sz w:val="40"/>
+          <w:sz w:val="36"/>
         </w:rPr>
         <w:t>Salesforce ↔ SAP — Business Integration Points</w:t>
       </w:r>
@@ -23,371 +23,12 @@
         <w:rPr>
           <w:i/>
           <w:color w:val="595959"/>
-          <w:sz w:val="22"/>
+          <w:sz w:val="20"/>
         </w:rPr>
-        <w:t>What flows between Salesforce and SAP at each step of the Wheels India business process</w:t>
+        <w:t>SAP is the system of record. Salesforce reads from SAP and pushes back only when a customer PO is recorded.</w:t>
       </w:r>
     </w:p>
     <w:p/>
-    <w:p>
-      <w:pPr>
-        <w:spacing w:before="280" w:after="120"/>
-      </w:pPr>
-      <w:r>
-        <w:rPr>
-          <w:b/>
-          <w:color w:val="1F3864"/>
-          <w:sz w:val="32"/>
-        </w:rPr>
-        <w:t>The principle</w:t>
-      </w:r>
-    </w:p>
-    <w:p>
-      <w:r>
-        <w:t>SAP stays the single source of truth for everything that is real — the product master, vendor list, work centres, sales orders, invoices, GRN and payment status. Salesforce owns everything that is customer-facing — leads, RFQs, quotes and the NPD workflow. Wherever these two worlds meet, the connection is described below in plain business terms: what is exchanged, who benefits, and what it replaces.</w:t>
-      </w:r>
-    </w:p>
-    <w:p>
-      <w:pPr>
-        <w:spacing w:before="280" w:after="120"/>
-      </w:pPr>
-      <w:r>
-        <w:rPr>
-          <w:b/>
-          <w:color w:val="1F3864"/>
-          <w:sz w:val="32"/>
-        </w:rPr>
-        <w:t>Business touchpoints</w:t>
-      </w:r>
-    </w:p>
-    <w:p>
-      <w:pPr>
-        <w:spacing w:before="280" w:after="120"/>
-      </w:pPr>
-      <w:r>
-        <w:rPr>
-          <w:b/>
-          <w:color w:val="1F7A1F"/>
-          <w:sz w:val="26"/>
-        </w:rPr>
-        <w:t>1. Engineering pulls existing part information while building the BOM</w:t>
-      </w:r>
-    </w:p>
-    <w:p>
-      <w:r>
-        <w:rPr>
-          <w:b/>
-        </w:rPr>
-        <w:t xml:space="preserve">What flows: </w:t>
-      </w:r>
-      <w:r>
-        <w:t>When Engineering enters a part number in the BOM, its price, description and specification appear automatically from SAP. Only genuinely new parts stay blank.</w:t>
-      </w:r>
-    </w:p>
-    <w:p>
-      <w:r>
-        <w:rPr>
-          <w:b/>
-        </w:rPr>
-        <w:t xml:space="preserve">Business value: </w:t>
-      </w:r>
-      <w:r>
-        <w:t>What it replaces: today engineers copy-paste from Excel or re-key from SAP. This removes that step, and removes the errors that come with it.</w:t>
-      </w:r>
-    </w:p>
-    <w:p>
-      <w:pPr>
-        <w:spacing w:before="280" w:after="120"/>
-      </w:pPr>
-      <w:r>
-        <w:rPr>
-          <w:b/>
-          <w:color w:val="1F7A1F"/>
-          <w:sz w:val="26"/>
-        </w:rPr>
-        <w:t>2. Procurement fills price only for the new parts</w:t>
-      </w:r>
-    </w:p>
-    <w:p>
-      <w:r>
-        <w:rPr>
-          <w:b/>
-        </w:rPr>
-        <w:t xml:space="preserve">What flows: </w:t>
-      </w:r>
-      <w:r>
-        <w:t>The parts left blank by SAP are the ones procurement needs to price. Vendor names come from SAP's vendor master; procurement picks and enters the negotiated price.</w:t>
-      </w:r>
-    </w:p>
-    <w:p>
-      <w:r>
-        <w:rPr>
-          <w:b/>
-        </w:rPr>
-        <w:t xml:space="preserve">Business value: </w:t>
-      </w:r>
-      <w:r>
-        <w:t>What it replaces: procurement no longer keeps its own vendor list; there is no risk of quoting against a vendor that is not in SAP.</w:t>
-      </w:r>
-    </w:p>
-    <w:p>
-      <w:pPr>
-        <w:spacing w:before="280" w:after="120"/>
-      </w:pPr>
-      <w:r>
-        <w:rPr>
-          <w:b/>
-          <w:color w:val="1F7A1F"/>
-          <w:sz w:val="26"/>
-        </w:rPr>
-        <w:t>3. Manufacturing uses live SAP activity rates for cycle time costing</w:t>
-      </w:r>
-    </w:p>
-    <w:p>
-      <w:r>
-        <w:rPr>
-          <w:b/>
-        </w:rPr>
-        <w:t xml:space="preserve">What flows: </w:t>
-      </w:r>
-      <w:r>
-        <w:t>When manufacturing selects a work centre and enters cycle time, the current activity rate is pulled from SAP so the costing reflects the real rate on the day the quote is prepared.</w:t>
-      </w:r>
-    </w:p>
-    <w:p>
-      <w:r>
-        <w:rPr>
-          <w:b/>
-        </w:rPr>
-        <w:t xml:space="preserve">Business value: </w:t>
-      </w:r>
-      <w:r>
-        <w:t>What it replaces: manual look-ups against a monthly rate sheet that goes stale.</w:t>
-      </w:r>
-    </w:p>
-    <w:p>
-      <w:pPr>
-        <w:spacing w:before="280" w:after="120"/>
-      </w:pPr>
-      <w:r>
-        <w:rPr>
-          <w:b/>
-          <w:color w:val="1F7A1F"/>
-          <w:sz w:val="26"/>
-        </w:rPr>
-        <w:t>4. Approved NPD parts are pushed back to SAP</w:t>
-      </w:r>
-    </w:p>
-    <w:p>
-      <w:r>
-        <w:rPr>
-          <w:b/>
-        </w:rPr>
-        <w:t xml:space="preserve">What flows: </w:t>
-      </w:r>
-      <w:r>
-        <w:t>Once costing is approved, the new part number and its details are pushed back to SAP so the same part can be invoiced, produced and tracked in the ERP as a standard master record.</w:t>
-      </w:r>
-    </w:p>
-    <w:p>
-      <w:r>
-        <w:rPr>
-          <w:b/>
-        </w:rPr>
-        <w:t xml:space="preserve">Business value: </w:t>
-      </w:r>
-      <w:r>
-        <w:t>What it replaces: today a new part is manually created in SAP after the fact, sometimes with a different code than the one used in the quote — the two-numbering-system problem the team decided to end.</w:t>
-      </w:r>
-    </w:p>
-    <w:p>
-      <w:pPr>
-        <w:spacing w:before="280" w:after="120"/>
-      </w:pPr>
-      <w:r>
-        <w:rPr>
-          <w:b/>
-          <w:color w:val="1F7A1F"/>
-          <w:sz w:val="26"/>
-        </w:rPr>
-        <w:t>5. Customer PO is recorded once, and creates the Sales Order in SAP</w:t>
-      </w:r>
-    </w:p>
-    <w:p>
-      <w:r>
-        <w:rPr>
-          <w:b/>
-        </w:rPr>
-        <w:t xml:space="preserve">What flows: </w:t>
-      </w:r>
-      <w:r>
-        <w:t>When the customer's PO is recorded in Salesforce (PO number, quantity, delivery date, expiry), it triggers the Sales Order in SAP against the same PO number and validates that quantity does not exceed the PO and that the date is within the PO expiry.</w:t>
-      </w:r>
-    </w:p>
-    <w:p>
-      <w:r>
-        <w:rPr>
-          <w:b/>
-        </w:rPr>
-        <w:t xml:space="preserve">Business value: </w:t>
-      </w:r>
-      <w:r>
-        <w:t>What it replaces: today the sales-order clerk can create anything in SAP; wrong PO numbers and over-supply against a PO happen. This closes that gap.</w:t>
-      </w:r>
-    </w:p>
-    <w:p>
-      <w:pPr>
-        <w:spacing w:before="280" w:after="120"/>
-      </w:pPr>
-      <w:r>
-        <w:rPr>
-          <w:b/>
-          <w:color w:val="1F7A1F"/>
-          <w:sz w:val="26"/>
-        </w:rPr>
-        <w:t>6. Invoices raised in SAP appear in Salesforce against the RFQ</w:t>
-      </w:r>
-    </w:p>
-    <w:p>
-      <w:r>
-        <w:rPr>
-          <w:b/>
-        </w:rPr>
-        <w:t xml:space="preserve">What flows: </w:t>
-      </w:r>
-      <w:r>
-        <w:t>Whenever finance raises an invoice in SAP, it shows up in the Salesforce record for that RFQ, tagged to the same PO.</w:t>
-      </w:r>
-    </w:p>
-    <w:p>
-      <w:r>
-        <w:rPr>
-          <w:b/>
-        </w:rPr>
-        <w:t xml:space="preserve">Business value: </w:t>
-      </w:r>
-      <w:r>
-        <w:t>What it replaces: today the sales team has to ask finance or wait for the CFO's PowerPoint to know whether an invoice has been raised.</w:t>
-      </w:r>
-    </w:p>
-    <w:p>
-      <w:pPr>
-        <w:spacing w:before="280" w:after="120"/>
-      </w:pPr>
-      <w:r>
-        <w:rPr>
-          <w:b/>
-          <w:color w:val="1F7A1F"/>
-          <w:sz w:val="26"/>
-        </w:rPr>
-        <w:t>7. GRN date from SAP starts the payment clock in Salesforce</w:t>
-      </w:r>
-    </w:p>
-    <w:p>
-      <w:r>
-        <w:rPr>
-          <w:b/>
-        </w:rPr>
-        <w:t xml:space="preserve">What flows: </w:t>
-      </w:r>
-      <w:r>
-        <w:t>When the customer confirms receipt and GRN is posted (through Catapult or manually in SAP), that date flows into Salesforce and sets the countdown against the customer's payment term (30 / 60 / 90 days).</w:t>
-      </w:r>
-    </w:p>
-    <w:p>
-      <w:r>
-        <w:rPr>
-          <w:b/>
-        </w:rPr>
-        <w:t xml:space="preserve">Business value: </w:t>
-      </w:r>
-      <w:r>
-        <w:t>What it replaces: today nobody in sales knows exactly when the clock started; escalations are late.</w:t>
-      </w:r>
-    </w:p>
-    <w:p>
-      <w:pPr>
-        <w:spacing w:before="280" w:after="120"/>
-      </w:pPr>
-      <w:r>
-        <w:rPr>
-          <w:b/>
-          <w:color w:val="1F7A1F"/>
-          <w:sz w:val="26"/>
-        </w:rPr>
-        <w:t>8. Payment receipts from SAP close the loop</w:t>
-      </w:r>
-    </w:p>
-    <w:p>
-      <w:r>
-        <w:rPr>
-          <w:b/>
-        </w:rPr>
-        <w:t xml:space="preserve">What flows: </w:t>
-      </w:r>
-      <w:r>
-        <w:t>When finance records a payment in SAP, it clears the corresponding invoice in Salesforce so the RFQ cycle is marked complete and revenue milestones (PO → Invoice → Payment) are all visible in one place.</w:t>
-      </w:r>
-    </w:p>
-    <w:p>
-      <w:r>
-        <w:rPr>
-          <w:b/>
-        </w:rPr>
-        <w:t xml:space="preserve">Business value: </w:t>
-      </w:r>
-      <w:r>
-        <w:t>What it replaces: separate collections tracker maintained outside SAP.</w:t>
-      </w:r>
-    </w:p>
-    <w:p>
-      <w:pPr>
-        <w:spacing w:before="280" w:after="120"/>
-      </w:pPr>
-      <w:r>
-        <w:rPr>
-          <w:b/>
-          <w:color w:val="1F7A1F"/>
-          <w:sz w:val="26"/>
-        </w:rPr>
-        <w:t>9. Part-level revenue history in Account 360</w:t>
-      </w:r>
-    </w:p>
-    <w:p>
-      <w:r>
-        <w:rPr>
-          <w:b/>
-        </w:rPr>
-        <w:t xml:space="preserve">What flows: </w:t>
-      </w:r>
-      <w:r>
-        <w:t>Total quantity dispatched and revenue against each part, per customer, per year, is pulled from SAP into the Account 360 view in Salesforce. This gives the sales rep three-year history at a glance when re-quoting the same customer.</w:t>
-      </w:r>
-    </w:p>
-    <w:p>
-      <w:r>
-        <w:rPr>
-          <w:b/>
-        </w:rPr>
-        <w:t xml:space="preserve">Business value: </w:t>
-      </w:r>
-      <w:r>
-        <w:t>What it replaces: manually running SAP reports to check what a part was sold for last time.</w:t>
-      </w:r>
-    </w:p>
-    <w:p>
-      <w:pPr>
-        <w:spacing w:before="280" w:after="120"/>
-      </w:pPr>
-      <w:r>
-        <w:rPr>
-          <w:b/>
-          <w:color w:val="1F3864"/>
-          <w:sz w:val="32"/>
-        </w:rPr>
-        <w:t>At a glance</w:t>
-      </w:r>
-    </w:p>
     <w:tbl>
       <w:tblPr>
         <w:tblStyle w:val="LightGrid-Accent1"/>
@@ -395,14 +36,15 @@
         <w:tblLook w:firstColumn="1" w:firstRow="1" w:lastColumn="0" w:lastRow="0" w:noHBand="0" w:noVBand="1" w:val="04A0"/>
       </w:tblPr>
       <w:tblGrid>
-        <w:gridCol w:w="3324"/>
-        <w:gridCol w:w="3324"/>
-        <w:gridCol w:w="3324"/>
+        <w:gridCol w:w="2550"/>
+        <w:gridCol w:w="2550"/>
+        <w:gridCol w:w="2550"/>
+        <w:gridCol w:w="2550"/>
       </w:tblGrid>
       <w:tr>
         <w:tc>
           <w:tcPr>
-            <w:tcW w:type="dxa" w:w="3324"/>
+            <w:tcW w:type="dxa" w:w="454"/>
             <w:shd w:val="clear" w:color="auto" w:fill="1F3864"/>
           </w:tcPr>
           <w:p>
@@ -411,13 +53,13 @@
                 <w:b/>
                 <w:color w:val="FFFFFF"/>
               </w:rPr>
-              <w:t>Business moment</w:t>
+              <w:t>#</w:t>
             </w:r>
           </w:p>
         </w:tc>
         <w:tc>
           <w:tcPr>
-            <w:tcW w:type="dxa" w:w="3324"/>
+            <w:tcW w:type="dxa" w:w="2551"/>
             <w:shd w:val="clear" w:color="auto" w:fill="1F3864"/>
           </w:tcPr>
           <w:p>
@@ -426,13 +68,13 @@
                 <w:b/>
                 <w:color w:val="FFFFFF"/>
               </w:rPr>
-              <w:t>What SAP provides</w:t>
+              <w:t>Touchpoint</w:t>
             </w:r>
           </w:p>
         </w:tc>
         <w:tc>
           <w:tcPr>
-            <w:tcW w:type="dxa" w:w="3324"/>
+            <w:tcW w:type="dxa" w:w="1474"/>
             <w:shd w:val="clear" w:color="auto" w:fill="1F3864"/>
           </w:tcPr>
           <w:p>
@@ -441,7 +83,22 @@
                 <w:b/>
                 <w:color w:val="FFFFFF"/>
               </w:rPr>
-              <w:t>Who benefits</w:t>
+              <w:t>Direction</w:t>
+            </w:r>
+          </w:p>
+        </w:tc>
+        <w:tc>
+          <w:tcPr>
+            <w:tcW w:type="dxa" w:w="5386"/>
+            <w:shd w:val="clear" w:color="auto" w:fill="1F3864"/>
+          </w:tcPr>
+          <w:p>
+            <w:r>
+              <w:rPr>
+                <w:b/>
+                <w:color w:val="FFFFFF"/>
+              </w:rPr>
+              <w:t>What happens</w:t>
             </w:r>
           </w:p>
         </w:tc>
@@ -449,31 +106,41 @@
       <w:tr>
         <w:tc>
           <w:tcPr>
-            <w:tcW w:type="dxa" w:w="3324"/>
+            <w:tcW w:type="dxa" w:w="454"/>
           </w:tcPr>
           <w:p>
             <w:r>
-              <w:t>BOM creation</w:t>
+              <w:t>1</w:t>
             </w:r>
           </w:p>
         </w:tc>
         <w:tc>
           <w:tcPr>
-            <w:tcW w:type="dxa" w:w="3324"/>
+            <w:tcW w:type="dxa" w:w="2551"/>
           </w:tcPr>
           <w:p>
             <w:r>
-              <w:t>Existing part price and spec</w:t>
+              <w:t>Product Master</w:t>
             </w:r>
           </w:p>
         </w:tc>
         <w:tc>
           <w:tcPr>
-            <w:tcW w:type="dxa" w:w="3324"/>
+            <w:tcW w:type="dxa" w:w="1474"/>
           </w:tcPr>
           <w:p>
             <w:r>
-              <w:t>Engineering</w:t>
+              <w:t>SAP → SF</w:t>
+            </w:r>
+          </w:p>
+        </w:tc>
+        <w:tc>
+          <w:tcPr>
+            <w:tcW w:type="dxa" w:w="5386"/>
+          </w:tcPr>
+          <w:p>
+            <w:r>
+              <w:t>All part serial numbers, descriptions and costs are created and maintained in SAP. For new parts developed through NPD, the team uploads the new serial number into SAP first; SAP then routes it to Salesforce, where it appears in the BOM even if pricing is not yet available.</w:t>
             </w:r>
           </w:p>
         </w:tc>
@@ -481,31 +148,41 @@
       <w:tr>
         <w:tc>
           <w:tcPr>
-            <w:tcW w:type="dxa" w:w="3324"/>
+            <w:tcW w:type="dxa" w:w="454"/>
           </w:tcPr>
           <w:p>
             <w:r>
-              <w:t>Procurement pricing</w:t>
+              <w:t>2</w:t>
             </w:r>
           </w:p>
         </w:tc>
         <w:tc>
           <w:tcPr>
-            <w:tcW w:type="dxa" w:w="3324"/>
+            <w:tcW w:type="dxa" w:w="2551"/>
           </w:tcPr>
           <w:p>
             <w:r>
-              <w:t>Vendor master</w:t>
+              <w:t>Part pricing (existing parts)</w:t>
             </w:r>
           </w:p>
         </w:tc>
         <w:tc>
           <w:tcPr>
-            <w:tcW w:type="dxa" w:w="3324"/>
+            <w:tcW w:type="dxa" w:w="1474"/>
           </w:tcPr>
           <w:p>
             <w:r>
-              <w:t>Procurement</w:t>
+              <w:t>SAP → SF</w:t>
+            </w:r>
+          </w:p>
+        </w:tc>
+        <w:tc>
+          <w:tcPr>
+            <w:tcW w:type="dxa" w:w="5386"/>
+          </w:tcPr>
+          <w:p>
+            <w:r>
+              <w:t>When Engineering enters a part serial number in the BOM, its cost from SAP auto-fills in Salesforce.</w:t>
             </w:r>
           </w:p>
         </w:tc>
@@ -513,31 +190,41 @@
       <w:tr>
         <w:tc>
           <w:tcPr>
-            <w:tcW w:type="dxa" w:w="3324"/>
+            <w:tcW w:type="dxa" w:w="454"/>
           </w:tcPr>
           <w:p>
             <w:r>
-              <w:t>Manufacturing cost</w:t>
+              <w:t>3</w:t>
             </w:r>
           </w:p>
         </w:tc>
         <w:tc>
           <w:tcPr>
-            <w:tcW w:type="dxa" w:w="3324"/>
+            <w:tcW w:type="dxa" w:w="2551"/>
           </w:tcPr>
           <w:p>
             <w:r>
-              <w:t>Work centre + activity rate</w:t>
+              <w:t>New-part pricing (fill-in)</w:t>
             </w:r>
           </w:p>
         </w:tc>
         <w:tc>
           <w:tcPr>
-            <w:tcW w:type="dxa" w:w="3324"/>
+            <w:tcW w:type="dxa" w:w="1474"/>
           </w:tcPr>
           <w:p>
             <w:r>
-              <w:t>Manufacturing / Costing</w:t>
+              <w:t>SF-side only</w:t>
+            </w:r>
+          </w:p>
+        </w:tc>
+        <w:tc>
+          <w:tcPr>
+            <w:tcW w:type="dxa" w:w="5386"/>
+          </w:tcPr>
+          <w:p>
+            <w:r>
+              <w:t>For parts newly uploaded into SAP that do not yet have a price, the field arrives blank in Salesforce. The Procurement team enters the price in Salesforce.</w:t>
             </w:r>
           </w:p>
         </w:tc>
@@ -545,31 +232,41 @@
       <w:tr>
         <w:tc>
           <w:tcPr>
-            <w:tcW w:type="dxa" w:w="3324"/>
+            <w:tcW w:type="dxa" w:w="454"/>
           </w:tcPr>
           <w:p>
             <w:r>
-              <w:t>NPD sign-off</w:t>
+              <w:t>4</w:t>
             </w:r>
           </w:p>
         </w:tc>
         <w:tc>
           <w:tcPr>
-            <w:tcW w:type="dxa" w:w="3324"/>
+            <w:tcW w:type="dxa" w:w="2551"/>
           </w:tcPr>
           <w:p>
             <w:r>
-              <w:t>Receives new part back</w:t>
+              <w:t>Part revenue history (Account 360)</w:t>
             </w:r>
           </w:p>
         </w:tc>
         <w:tc>
           <w:tcPr>
-            <w:tcW w:type="dxa" w:w="3324"/>
+            <w:tcW w:type="dxa" w:w="1474"/>
           </w:tcPr>
           <w:p>
             <w:r>
-              <w:t>ERP team / Finance</w:t>
+              <w:t>SAP → SF</w:t>
+            </w:r>
+          </w:p>
+        </w:tc>
+        <w:tc>
+          <w:tcPr>
+            <w:tcW w:type="dxa" w:w="5386"/>
+          </w:tcPr>
+          <w:p>
+            <w:r>
+              <w:t>For every alphanumeric part number, the revenue generated per customer is pulled from SAP into the Account 360 view in Salesforce.</w:t>
             </w:r>
           </w:p>
         </w:tc>
@@ -577,31 +274,41 @@
       <w:tr>
         <w:tc>
           <w:tcPr>
-            <w:tcW w:type="dxa" w:w="3324"/>
+            <w:tcW w:type="dxa" w:w="454"/>
           </w:tcPr>
           <w:p>
             <w:r>
-              <w:t>PO recorded</w:t>
+              <w:t>5</w:t>
             </w:r>
           </w:p>
         </w:tc>
         <w:tc>
           <w:tcPr>
-            <w:tcW w:type="dxa" w:w="3324"/>
+            <w:tcW w:type="dxa" w:w="2551"/>
           </w:tcPr>
           <w:p>
             <w:r>
-              <w:t>Creates matching Sales Order</w:t>
+              <w:t>Purchase Order → Sales Order</w:t>
             </w:r>
           </w:p>
         </w:tc>
         <w:tc>
           <w:tcPr>
-            <w:tcW w:type="dxa" w:w="3324"/>
+            <w:tcW w:type="dxa" w:w="1474"/>
           </w:tcPr>
           <w:p>
             <w:r>
-              <w:t>Sales / SAP order desk</w:t>
+              <w:t>SF → SAP</w:t>
+            </w:r>
+          </w:p>
+        </w:tc>
+        <w:tc>
+          <w:tcPr>
+            <w:tcW w:type="dxa" w:w="5386"/>
+          </w:tcPr>
+          <w:p>
+            <w:r>
+              <w:t>When the customer PO is recorded manually in Salesforce, a trigger fires. The PO number written in the Salesforce field is sent to SAP; SAP creates the Sales Order against that PO.</w:t>
             </w:r>
           </w:p>
         </w:tc>
@@ -609,7 +316,17 @@
       <w:tr>
         <w:tc>
           <w:tcPr>
-            <w:tcW w:type="dxa" w:w="3324"/>
+            <w:tcW w:type="dxa" w:w="454"/>
+          </w:tcPr>
+          <w:p>
+            <w:r>
+              <w:t>6</w:t>
+            </w:r>
+          </w:p>
+        </w:tc>
+        <w:tc>
+          <w:tcPr>
+            <w:tcW w:type="dxa" w:w="2551"/>
           </w:tcPr>
           <w:p>
             <w:r>
@@ -619,21 +336,21 @@
         </w:tc>
         <w:tc>
           <w:tcPr>
-            <w:tcW w:type="dxa" w:w="3324"/>
+            <w:tcW w:type="dxa" w:w="1474"/>
           </w:tcPr>
           <w:p>
             <w:r>
-              <w:t>Invoice raised</w:t>
+              <w:t>SAP → SF</w:t>
             </w:r>
           </w:p>
         </w:tc>
         <w:tc>
           <w:tcPr>
-            <w:tcW w:type="dxa" w:w="3324"/>
+            <w:tcW w:type="dxa" w:w="5386"/>
           </w:tcPr>
           <w:p>
             <w:r>
-              <w:t>Sales / Finance</w:t>
+              <w:t>SAP raises the invoice against the Sales Order and confirms back to Salesforce.</w:t>
             </w:r>
           </w:p>
         </w:tc>
@@ -641,208 +358,49 @@
       <w:tr>
         <w:tc>
           <w:tcPr>
-            <w:tcW w:type="dxa" w:w="3324"/>
+            <w:tcW w:type="dxa" w:w="454"/>
           </w:tcPr>
           <w:p>
             <w:r>
-              <w:t>GRN</w:t>
+              <w:t>7</w:t>
             </w:r>
           </w:p>
         </w:tc>
         <w:tc>
           <w:tcPr>
-            <w:tcW w:type="dxa" w:w="3324"/>
+            <w:tcW w:type="dxa" w:w="2551"/>
           </w:tcPr>
           <w:p>
             <w:r>
-              <w:t>GRN date</w:t>
+              <w:t>GRN confirmation</w:t>
             </w:r>
           </w:p>
         </w:tc>
         <w:tc>
           <w:tcPr>
-            <w:tcW w:type="dxa" w:w="3324"/>
+            <w:tcW w:type="dxa" w:w="1474"/>
           </w:tcPr>
           <w:p>
             <w:r>
-              <w:t>Collections</w:t>
-            </w:r>
-          </w:p>
-        </w:tc>
-      </w:tr>
-      <w:tr>
-        <w:tc>
-          <w:tcPr>
-            <w:tcW w:type="dxa" w:w="3324"/>
-          </w:tcPr>
-          <w:p>
-            <w:r>
-              <w:t>Payment</w:t>
+              <w:t>SAP → SF</w:t>
             </w:r>
           </w:p>
         </w:tc>
         <w:tc>
           <w:tcPr>
-            <w:tcW w:type="dxa" w:w="3324"/>
+            <w:tcW w:type="dxa" w:w="5386"/>
           </w:tcPr>
           <w:p>
             <w:r>
-              <w:t>Payment receipt</w:t>
-            </w:r>
-          </w:p>
-        </w:tc>
-        <w:tc>
-          <w:tcPr>
-            <w:tcW w:type="dxa" w:w="3324"/>
-          </w:tcPr>
-          <w:p>
-            <w:r>
-              <w:t>Finance / Sales</w:t>
-            </w:r>
-          </w:p>
-        </w:tc>
-      </w:tr>
-      <w:tr>
-        <w:tc>
-          <w:tcPr>
-            <w:tcW w:type="dxa" w:w="3324"/>
-          </w:tcPr>
-          <w:p>
-            <w:r>
-              <w:t>Account 360</w:t>
-            </w:r>
-          </w:p>
-        </w:tc>
-        <w:tc>
-          <w:tcPr>
-            <w:tcW w:type="dxa" w:w="3324"/>
-          </w:tcPr>
-          <w:p>
-            <w:r>
-              <w:t>Historical part revenue</w:t>
-            </w:r>
-          </w:p>
-        </w:tc>
-        <w:tc>
-          <w:tcPr>
-            <w:tcW w:type="dxa" w:w="3324"/>
-          </w:tcPr>
-          <w:p>
-            <w:r>
-              <w:t>Sales rep</w:t>
+              <w:t>GRN update from SAP confirms the order has been received by the customer. On this confirmation the order is marked as delivered in Salesforce.</w:t>
             </w:r>
           </w:p>
         </w:tc>
       </w:tr>
     </w:tbl>
-    <w:p/>
-    <w:p>
-      <w:pPr>
-        <w:spacing w:before="280" w:after="120"/>
-      </w:pPr>
-      <w:r>
-        <w:rPr>
-          <w:b/>
-          <w:color w:val="1F3864"/>
-          <w:sz w:val="32"/>
-        </w:rPr>
-        <w:t>What is NOT a SAP integration</w:t>
-      </w:r>
-    </w:p>
-    <w:p>
-      <w:r>
-        <w:t>Some steps of the process happen entirely inside Salesforce and do not touch SAP. These are called out here so nobody assumes they are integration points:</w:t>
-      </w:r>
-    </w:p>
-    <w:p>
-      <w:pPr>
-        <w:pStyle w:val="ListBullet"/>
-      </w:pPr>
-      <w:r>
-        <w:rPr>
-          <w:b/>
-        </w:rPr>
-        <w:t>Index-based / 6-monthly price revision</w:t>
-      </w:r>
-      <w:r>
-        <w:t xml:space="preserve"> — Runs entirely in Salesforce. The base price used for revision is the quote line-item price already stored in Salesforce at quote creation. Engineering supplies the formula; Salesforce recalculates and generates the revised-price PDF. Sending the PDF to the customer is a manual action, not an SAP push.</w:t>
-      </w:r>
-    </w:p>
-    <w:p>
-      <w:pPr>
-        <w:pStyle w:val="ListBullet"/>
-      </w:pPr>
-      <w:r>
-        <w:rPr>
-          <w:b/>
-        </w:rPr>
-        <w:t>Contract-based pricing &amp; expiry alerts (BRN 5.4)</w:t>
-      </w:r>
-      <w:r>
-        <w:t xml:space="preserve"> — Salesforce-only. Consumption tracking is informational; no SAP order-system integration in Phase 1.</w:t>
-      </w:r>
-    </w:p>
-    <w:p>
-      <w:pPr>
-        <w:pStyle w:val="ListBullet"/>
-      </w:pPr>
-      <w:r>
-        <w:rPr>
-          <w:b/>
-        </w:rPr>
-        <w:t>Discount / deviation approvals</w:t>
-      </w:r>
-      <w:r>
-        <w:t xml:space="preserve"> — Approval workflow lives in Salesforce; SAP is not consulted.</w:t>
-      </w:r>
-    </w:p>
-    <w:p>
-      <w:pPr>
-        <w:pStyle w:val="ListBullet"/>
-      </w:pPr>
-      <w:r>
-        <w:rPr>
-          <w:b/>
-        </w:rPr>
-        <w:t>Activity logging, email timeline, dashboards</w:t>
-      </w:r>
-      <w:r>
-        <w:t xml:space="preserve"> — Salesforce-native. SAP data appears in dashboards through the touchpoints above, but the reports themselves are Salesforce.</w:t>
-      </w:r>
-    </w:p>
-    <w:p>
-      <w:pPr>
-        <w:spacing w:before="280" w:after="120"/>
-      </w:pPr>
-      <w:r>
-        <w:rPr>
-          <w:b/>
-          <w:color w:val="1F3864"/>
-          <w:sz w:val="32"/>
-        </w:rPr>
-        <w:t>Ground rule</w:t>
-      </w:r>
-    </w:p>
-    <w:p>
-      <w:r>
-        <w:t>Nothing in Salesforce overrides SAP. Where a value exists in SAP, Salesforce shows it — it does not recompute it. Where a value is created in Salesforce (a quote, an RFQ, a customer PO record), and it needs to become an actual in SAP (a sales order, a new part master), Salesforce pushes it once and SAP takes over from there.</w:t>
-      </w:r>
-    </w:p>
-    <w:p>
-      <w:pPr>
-        <w:jc w:val="center"/>
-      </w:pPr>
-      <w:r>
-        <w:rPr>
-          <w:i/>
-          <w:color w:val="969696"/>
-        </w:rPr>
-        <w:t>— End of document —</w:t>
-      </w:r>
-    </w:p>
     <w:sectPr>
       <w:pgSz w:w="12240" w:h="15840"/>
-      <w:pgMar w:top="1020" w:right="1134" w:bottom="1020" w:left="1134" w:header="720" w:footer="720" w:gutter="0"/>
+      <w:pgMar w:top="1020" w:right="1020" w:bottom="1020" w:left="1020" w:header="720" w:footer="720" w:gutter="0"/>
       <w:cols w:space="720"/>
       <w:docGrid w:linePitch="360"/>
     </w:sectPr>

</xml_diff>